<commit_message>
Product Maintenance document set v1.5 and End-to-End Conformance Register v1.3
FRS, UX Design, Process and Storyboards and Reports v1.5 of BRD-03 with the insurer page
(FRPM.023.02) and the field-level change history (FRPM.021.03); Developer Specification v1.2,
Data Dictionary v1.1 (insurer contacts and bank accounts), User Stories v1.1 and review
workbooks v1.2; the superseded versions are removed. Conformance Register v1.3 closes gaps G04,
G05, G08 and G09 on the automated checks of the release, with the parts left for later recorded
on each gap; decision log entry O-014, document register and drop indexes updated.
</commit_message>
<xml_diff>
--- a/docs/deliverables/out/Programme/BDOI_Template_FRS/BRD-03_Product_Maintenance/BIBS_Inputs_BRD-03_How_to_Read_this_Pack_v1.0.docx
+++ b/docs/deliverables/out/Programme/BDOI_Template_FRS/BRD-03_Product_Maintenance/BIBS_Inputs_BRD-03_How_to_Read_this_Pack_v1.0.docx
@@ -1747,7 +1747,7 @@
                 <w:i w:val="0"/>
                 <w:sz w:val="18"/>
               </w:rPr>
-              <w:t>1.4</w:t>
+              <w:t>1.5</w:t>
             </w:r>
           </w:p>
         </w:tc>
@@ -1847,7 +1847,7 @@
                 <w:i w:val="0"/>
                 <w:sz w:val="18"/>
               </w:rPr>
-              <w:t>1.4</w:t>
+              <w:t>1.5</w:t>
             </w:r>
           </w:p>
         </w:tc>
@@ -1947,7 +1947,7 @@
                 <w:i w:val="0"/>
                 <w:sz w:val="18"/>
               </w:rPr>
-              <w:t>1.4</w:t>
+              <w:t>1.5</w:t>
             </w:r>
           </w:p>
         </w:tc>
@@ -2047,7 +2047,7 @@
                 <w:i w:val="0"/>
                 <w:sz w:val="18"/>
               </w:rPr>
-              <w:t>1.4</w:t>
+              <w:t>1.5</w:t>
             </w:r>
           </w:p>
         </w:tc>
@@ -2247,7 +2247,7 @@
                 <w:i w:val="0"/>
                 <w:sz w:val="18"/>
               </w:rPr>
-              <w:t>1.1</w:t>
+              <w:t>1.2</w:t>
             </w:r>
           </w:p>
         </w:tc>
@@ -2347,7 +2347,7 @@
                 <w:i w:val="0"/>
                 <w:sz w:val="18"/>
               </w:rPr>
-              <w:t>1.0</w:t>
+              <w:t>1.1</w:t>
             </w:r>
           </w:p>
         </w:tc>
@@ -2447,7 +2447,7 @@
                 <w:i w:val="0"/>
                 <w:sz w:val="18"/>
               </w:rPr>
-              <w:t>1.0</w:t>
+              <w:t>1.1</w:t>
             </w:r>
           </w:p>
         </w:tc>
@@ -2547,7 +2547,7 @@
                 <w:i w:val="0"/>
                 <w:sz w:val="18"/>
               </w:rPr>
-              <w:t>1.1</w:t>
+              <w:t>1.2</w:t>
             </w:r>
           </w:p>
         </w:tc>
@@ -2647,7 +2647,7 @@
                 <w:i w:val="0"/>
                 <w:sz w:val="18"/>
               </w:rPr>
-              <w:t>1.1</w:t>
+              <w:t>1.2</w:t>
             </w:r>
           </w:p>
         </w:tc>
@@ -2747,7 +2747,7 @@
                 <w:i w:val="0"/>
                 <w:sz w:val="18"/>
               </w:rPr>
-              <w:t>1.1</w:t>
+              <w:t>1.2</w:t>
             </w:r>
           </w:p>
         </w:tc>
@@ -2847,7 +2847,7 @@
                 <w:i w:val="0"/>
                 <w:sz w:val="18"/>
               </w:rPr>
-              <w:t>1.1</w:t>
+              <w:t>1.2</w:t>
             </w:r>
           </w:p>
         </w:tc>
@@ -2947,7 +2947,7 @@
                 <w:i w:val="0"/>
                 <w:sz w:val="18"/>
               </w:rPr>
-              <w:t>1.1</w:t>
+              <w:t>1.2</w:t>
             </w:r>
           </w:p>
         </w:tc>
@@ -3047,7 +3047,7 @@
                 <w:i w:val="0"/>
                 <w:sz w:val="18"/>
               </w:rPr>
-              <w:t>1.1</w:t>
+              <w:t>1.2</w:t>
             </w:r>
           </w:p>
         </w:tc>

</xml_diff>

<commit_message>
Product Maintenance set v1.6, Customer Servicing Facility FRS and test plan v1.2, Conformance Register v1.4
BRD-03: FRS, UX Design, Process and Storyboards and Reports v1.6 with the Ledger
Accounts tab of the insurer page (FRPM.023.02) and the Master Data Change Log
(FRPM.021.03); Developer Specification v1.3, User Stories v1.2 and review
workbooks v1.3. BRD-09: FRS and test plan v1.2 aligned with the case management
delivered. Conformance Register v1.4: gap G01 closed, BRD-09 walkthrough steps
P2.1 to P2.12 pass on a fresh SIT/UAT environment, remaining parts of G04, G05,
G08 and G09 delivered. Decision log entry O-015, document register and drop
indexes updated; superseded versions removed.
</commit_message>
<xml_diff>
--- a/docs/deliverables/out/Programme/BDOI_Template_FRS/BRD-03_Product_Maintenance/BIBS_Inputs_BRD-03_How_to_Read_this_Pack_v1.0.docx
+++ b/docs/deliverables/out/Programme/BDOI_Template_FRS/BRD-03_Product_Maintenance/BIBS_Inputs_BRD-03_How_to_Read_this_Pack_v1.0.docx
@@ -908,7 +908,7 @@
                 <w:rFonts w:ascii="Arial" w:hAnsi="Arial" w:cs="Arial"/>
                 <w:lang w:val="en-US" w:eastAsia="en-US"/>
               </w:rPr>
-              <w:t xml:space="preserve">10/16/2026</w:t>
+              <w:t xml:space="preserve">10/17/2026</w:t>
             </w:r>
           </w:p>
         </w:tc>
@@ -1126,7 +1126,7 @@
                 <w:rFonts w:ascii="Arial" w:hAnsi="Arial" w:cs="Arial"/>
                 <w:lang w:val="en-US" w:eastAsia="en-US"/>
               </w:rPr>
-              <w:t xml:space="preserve">10/16/2026</w:t>
+              <w:t xml:space="preserve">10/17/2026</w:t>
             </w:r>
           </w:p>
         </w:tc>
@@ -1356,7 +1356,7 @@
                 <w:sz w:val="18"/>
                 <w:szCs w:val="18"/>
               </w:rPr>
-              <w:t xml:space="preserve">16 Oct 2026</w:t>
+              <w:t xml:space="preserve">17 Oct 2026</w:t>
             </w:r>
           </w:p>
         </w:tc>
@@ -1747,7 +1747,7 @@
                 <w:i w:val="0"/>
                 <w:sz w:val="18"/>
               </w:rPr>
-              <w:t>1.5</w:t>
+              <w:t>1.6</w:t>
             </w:r>
           </w:p>
         </w:tc>
@@ -1847,7 +1847,7 @@
                 <w:i w:val="0"/>
                 <w:sz w:val="18"/>
               </w:rPr>
-              <w:t>1.5</w:t>
+              <w:t>1.6</w:t>
             </w:r>
           </w:p>
         </w:tc>
@@ -1947,7 +1947,7 @@
                 <w:i w:val="0"/>
                 <w:sz w:val="18"/>
               </w:rPr>
-              <w:t>1.5</w:t>
+              <w:t>1.6</w:t>
             </w:r>
           </w:p>
         </w:tc>
@@ -2047,7 +2047,7 @@
                 <w:i w:val="0"/>
                 <w:sz w:val="18"/>
               </w:rPr>
-              <w:t>1.5</w:t>
+              <w:t>1.6</w:t>
             </w:r>
           </w:p>
         </w:tc>
@@ -2247,7 +2247,7 @@
                 <w:i w:val="0"/>
                 <w:sz w:val="18"/>
               </w:rPr>
-              <w:t>1.2</w:t>
+              <w:t>1.3</w:t>
             </w:r>
           </w:p>
         </w:tc>
@@ -2447,7 +2447,7 @@
                 <w:i w:val="0"/>
                 <w:sz w:val="18"/>
               </w:rPr>
-              <w:t>1.1</w:t>
+              <w:t>1.2</w:t>
             </w:r>
           </w:p>
         </w:tc>
@@ -2547,7 +2547,7 @@
                 <w:i w:val="0"/>
                 <w:sz w:val="18"/>
               </w:rPr>
-              <w:t>1.2</w:t>
+              <w:t>1.3</w:t>
             </w:r>
           </w:p>
         </w:tc>
@@ -2647,7 +2647,7 @@
                 <w:i w:val="0"/>
                 <w:sz w:val="18"/>
               </w:rPr>
-              <w:t>1.2</w:t>
+              <w:t>1.3</w:t>
             </w:r>
           </w:p>
         </w:tc>
@@ -2747,7 +2747,7 @@
                 <w:i w:val="0"/>
                 <w:sz w:val="18"/>
               </w:rPr>
-              <w:t>1.2</w:t>
+              <w:t>1.3</w:t>
             </w:r>
           </w:p>
         </w:tc>
@@ -2847,7 +2847,7 @@
                 <w:i w:val="0"/>
                 <w:sz w:val="18"/>
               </w:rPr>
-              <w:t>1.2</w:t>
+              <w:t>1.3</w:t>
             </w:r>
           </w:p>
         </w:tc>
@@ -2947,7 +2947,7 @@
                 <w:i w:val="0"/>
                 <w:sz w:val="18"/>
               </w:rPr>
-              <w:t>1.2</w:t>
+              <w:t>1.3</w:t>
             </w:r>
           </w:p>
         </w:tc>
@@ -3047,7 +3047,7 @@
                 <w:i w:val="0"/>
                 <w:sz w:val="18"/>
               </w:rPr>
-              <w:t>1.2</w:t>
+              <w:t>1.3</w:t>
             </w:r>
           </w:p>
         </w:tc>

</xml_diff>